<commit_message>
Inject manual data into DOCX template
</commit_message>
<xml_diff>
--- a/backend/templates/notarial-act-template.docx
+++ b/backend/templates/notarial-act-template.docx
@@ -1178,7 +1178,7 @@
                 <w:szCs w:val="21"/>
                 <w:lang w:val="bg-BG" w:eastAsia="bg-BG"/>
               </w:rPr>
-              <w:t>ЕМИЛИЯ ИВАНОВА ГОРАНОВА - ВЕСТНЕР</w:t>
+              <w:t>{{sellerName}}</w:t>
             </w:r>
             <w:r>
               <w:rPr>
@@ -1443,7 +1443,7 @@
                 <w:szCs w:val="21"/>
                 <w:lang w:val="bg-BG" w:eastAsia="bg-BG"/>
               </w:rPr>
-              <w:t>КАМЕЛИЯ АНГЕЛОВА АНГЕЛОВА – ТОДОРОВА</w:t>
+              <w:t>{{buyerName}}</w:t>
             </w:r>
             <w:r>
               <w:rPr>
@@ -1657,7 +1657,7 @@
                 <w:szCs w:val="21"/>
                 <w:lang w:val="bg-BG" w:eastAsia="bg-BG"/>
               </w:rPr>
-              <w:t>ЕМИЛИЯ ИВАНОВА ГОРАНОВА - ВЕСТНЕР</w:t>
+              <w:t>{{sellerName}}</w:t>
             </w:r>
             <w:r>
               <w:rPr>
@@ -1686,7 +1686,7 @@
                 <w:szCs w:val="21"/>
                 <w:lang w:val="bg-BG" w:eastAsia="bg-BG"/>
               </w:rPr>
-              <w:t>КАМЕЛИЯ АНГЕЛОВА АНГЕЛОВА – ТОДОРОВА</w:t>
+              <w:t>{{buyerName}}</w:t>
             </w:r>
             <w:r>
               <w:rPr>
@@ -2058,127 +2058,55 @@
                 <w:szCs w:val="21"/>
                 <w:lang w:val="bg-BG" w:eastAsia="bg-BG"/>
               </w:rPr>
-              <w:t>360 0</w:t>
-            </w:r>
-            <w:r>
-              <w:rPr>
-                <w:rFonts w:ascii="Georgia" w:eastAsia="Calibri" w:hAnsi="Georgia"/>
+              <w:t>{{salePrice}}</w:t>
+            </w:r>
+            <w:r>
+              <w:rPr>
+                <w:rFonts w:ascii="Georgia" w:eastAsia="Calibri" w:hAnsi="Georgia"/>
+                <w:sz w:val="21"/>
+                <w:szCs w:val="21"/>
+                <w:lang w:val="bg-BG" w:eastAsia="bg-BG"/>
+              </w:rPr>
+              <w:t>.</w:t>
+            </w:r>
+            <w:r>
+              <w:rPr>
+                <w:rFonts w:ascii="Georgia" w:eastAsia="Calibri" w:hAnsi="Georgia"/>
+                <w:sz w:val="21"/>
+                <w:szCs w:val="21"/>
+                <w:lang w:val="bg-BG" w:eastAsia="bg-BG"/>
+              </w:rPr>
+              <w:t>-----------------------------------------------------------------</w:t>
+            </w:r>
+          </w:p>
+          <w:p>
+            <w:pPr>
+              <w:jc w:val="both"/>
+              <w:rPr>
+                <w:rFonts w:ascii="Georgia" w:hAnsi="Georgia"/>
+                <w:sz w:val="21"/>
+                <w:szCs w:val="21"/>
+                <w:lang w:val="bg-BG" w:eastAsia="bg-BG"/>
+              </w:rPr>
+            </w:pPr>
+            <w:r>
+              <w:rPr>
+                <w:rFonts w:ascii="Georgia" w:hAnsi="Georgia"/>
                 <w:b/>
                 <w:bCs/>
                 <w:sz w:val="21"/>
                 <w:szCs w:val="21"/>
                 <w:lang w:val="bg-BG" w:eastAsia="bg-BG"/>
               </w:rPr>
-              <w:t>00,00</w:t>
-            </w:r>
-            <w:r>
-              <w:rPr>
-                <w:rFonts w:ascii="Georgia" w:eastAsia="Calibri" w:hAnsi="Georgia"/>
+              <w:t xml:space="preserve">           </w:t>
+            </w:r>
+            <w:r>
+              <w:rPr>
+                <w:rFonts w:ascii="Georgia" w:hAnsi="Georgia"/>
                 <w:b/>
                 <w:bCs/>
                 <w:sz w:val="21"/>
                 <w:szCs w:val="21"/>
-                <w:lang w:eastAsia="bg-BG"/>
-              </w:rPr>
-              <w:t xml:space="preserve"> </w:t>
-            </w:r>
-            <w:r>
-              <w:rPr>
-                <w:rFonts w:ascii="Georgia" w:eastAsia="Calibri" w:hAnsi="Georgia"/>
-                <w:b/>
-                <w:bCs/>
-                <w:sz w:val="21"/>
-                <w:szCs w:val="21"/>
-                <w:lang w:val="bg-BG" w:eastAsia="bg-BG"/>
-              </w:rPr>
-              <w:t>евро</w:t>
-            </w:r>
-            <w:r>
-              <w:rPr>
-                <w:rFonts w:ascii="Georgia" w:eastAsia="Calibri" w:hAnsi="Georgia"/>
-                <w:sz w:val="21"/>
-                <w:szCs w:val="21"/>
-                <w:lang w:eastAsia="bg-BG"/>
-              </w:rPr>
-              <w:t xml:space="preserve"> </w:t>
-            </w:r>
-            <w:r>
-              <w:rPr>
-                <w:rFonts w:ascii="Georgia" w:eastAsia="Calibri" w:hAnsi="Georgia"/>
-                <w:b/>
-                <w:sz w:val="21"/>
-                <w:szCs w:val="21"/>
-                <w:lang w:eastAsia="bg-BG"/>
-              </w:rPr>
-              <w:t>(</w:t>
-            </w:r>
-            <w:r>
-              <w:rPr>
-                <w:rFonts w:ascii="Georgia" w:eastAsia="Calibri" w:hAnsi="Georgia"/>
-                <w:b/>
-                <w:sz w:val="21"/>
-                <w:szCs w:val="21"/>
-                <w:lang w:val="bg-BG" w:eastAsia="bg-BG"/>
-              </w:rPr>
-              <w:t>триста и шестдесет хиляди евро</w:t>
-            </w:r>
-            <w:r>
-              <w:rPr>
-                <w:rFonts w:ascii="Georgia" w:eastAsia="Calibri" w:hAnsi="Georgia"/>
-                <w:b/>
-                <w:sz w:val="21"/>
-                <w:szCs w:val="21"/>
-                <w:lang w:eastAsia="bg-BG"/>
-              </w:rPr>
-              <w:t>)</w:t>
-            </w:r>
-            <w:r>
-              <w:rPr>
-                <w:rFonts w:ascii="Georgia" w:eastAsia="Calibri" w:hAnsi="Georgia"/>
-                <w:sz w:val="21"/>
-                <w:szCs w:val="21"/>
-                <w:lang w:val="bg-BG" w:eastAsia="bg-BG"/>
-              </w:rPr>
-              <w:t>.</w:t>
-            </w:r>
-            <w:r>
-              <w:rPr>
-                <w:rFonts w:ascii="Georgia" w:eastAsia="Calibri" w:hAnsi="Georgia"/>
-                <w:sz w:val="21"/>
-                <w:szCs w:val="21"/>
-                <w:lang w:val="bg-BG" w:eastAsia="bg-BG"/>
-              </w:rPr>
-              <w:t>-----------------------------------------------------------------</w:t>
-            </w:r>
-          </w:p>
-          <w:p>
-            <w:pPr>
-              <w:jc w:val="both"/>
-              <w:rPr>
-                <w:rFonts w:ascii="Georgia" w:hAnsi="Georgia"/>
-                <w:sz w:val="21"/>
-                <w:szCs w:val="21"/>
-                <w:lang w:val="bg-BG" w:eastAsia="bg-BG"/>
-              </w:rPr>
-            </w:pPr>
-            <w:r>
-              <w:rPr>
-                <w:rFonts w:ascii="Georgia" w:hAnsi="Georgia"/>
-                <w:b/>
-                <w:bCs/>
-                <w:sz w:val="21"/>
-                <w:szCs w:val="21"/>
-                <w:lang w:val="bg-BG" w:eastAsia="bg-BG"/>
-              </w:rPr>
-              <w:t xml:space="preserve">           </w:t>
-            </w:r>
-            <w:r>
-              <w:rPr>
-                <w:rFonts w:ascii="Georgia" w:hAnsi="Georgia"/>
-                <w:b/>
-                <w:bCs/>
-                <w:sz w:val="21"/>
-                <w:szCs w:val="21"/>
                 <w:lang w:val="bg-BG" w:eastAsia="bg-BG"/>
               </w:rPr>
               <w:t xml:space="preserve">2. </w:t>
@@ -2200,7 +2128,7 @@
                 <w:szCs w:val="21"/>
                 <w:lang w:val="bg-BG" w:eastAsia="bg-BG"/>
               </w:rPr>
-              <w:t>ЕМИЛИЯ ИВАНОВА ГОРАНОВА - ВЕСТНЕР</w:t>
+              <w:t>{{sellerName}}</w:t>
             </w:r>
             <w:r>
               <w:rPr>
@@ -2230,7 +2158,7 @@
                 <w:szCs w:val="21"/>
                 <w:lang w:val="bg-BG" w:eastAsia="bg-BG"/>
               </w:rPr>
-              <w:t>КАМЕЛИЯ АНГЕЛОВА АНГЕЛОВА – ТОДОРОВА</w:t>
+              <w:t>{{buyerName}}</w:t>
             </w:r>
             <w:r>
               <w:rPr>
@@ -2313,7 +2241,7 @@
                 <w:szCs w:val="21"/>
                 <w:lang w:val="bg-BG" w:eastAsia="bg-BG"/>
               </w:rPr>
-              <w:t>КАМЕЛИЯ АНГЕЛОВА АНГЕЛОВА – ТОДОРОВА</w:t>
+              <w:t>{{buyerName}}</w:t>
             </w:r>
             <w:r>
               <w:rPr>
@@ -2344,17 +2272,16 @@
                 <w:szCs w:val="21"/>
                 <w:lang w:val="bg-BG" w:eastAsia="bg-BG"/>
               </w:rPr>
-              <w:t xml:space="preserve">ЕМИЛИЯ ИВАНОВА ГОРАНОВА </w:t>
+              <w:t>{{sellerName}}</w:t>
             </w:r>
             <w:r>
               <w:rPr>
                 <w:rFonts w:ascii="Georgia" w:hAnsi="Georgia" w:cs="Courier New"/>
-                <w:b/>
-                <w:sz w:val="21"/>
-                <w:szCs w:val="21"/>
-                <w:lang w:val="bg-BG" w:eastAsia="bg-BG"/>
-              </w:rPr>
-              <w:t>–</w:t>
+                <w:sz w:val="21"/>
+                <w:szCs w:val="21"/>
+                <w:lang w:val="bg-BG" w:eastAsia="bg-BG"/>
+              </w:rPr>
+              <w:t xml:space="preserve"> сума в размер на </w:t>
             </w:r>
             <w:r>
               <w:rPr>
@@ -2364,7 +2291,7 @@
                 <w:szCs w:val="21"/>
                 <w:lang w:val="bg-BG" w:eastAsia="bg-BG"/>
               </w:rPr>
-              <w:t xml:space="preserve"> ВЕСТНЕР</w:t>
+              <w:t>36 000 евро (тридесет и шест хиляди евро)</w:t>
             </w:r>
             <w:r>
               <w:rPr>
@@ -2373,65 +2300,46 @@
                 <w:szCs w:val="21"/>
                 <w:lang w:val="bg-BG" w:eastAsia="bg-BG"/>
               </w:rPr>
-              <w:t xml:space="preserve"> сума в размер на </w:t>
+              <w:t xml:space="preserve">, представляваща капаро от 10 % (десет процента) от договорената </w:t>
             </w:r>
             <w:r>
               <w:rPr>
                 <w:rFonts w:ascii="Georgia" w:hAnsi="Georgia" w:cs="Courier New"/>
-                <w:b/>
-                <w:sz w:val="21"/>
-                <w:szCs w:val="21"/>
-                <w:lang w:val="bg-BG" w:eastAsia="bg-BG"/>
-              </w:rPr>
-              <w:t xml:space="preserve">36 000 евро </w:t>
+                <w:sz w:val="21"/>
+                <w:szCs w:val="21"/>
+                <w:lang w:val="bg-BG" w:eastAsia="bg-BG"/>
+              </w:rPr>
+              <w:t xml:space="preserve">обща </w:t>
             </w:r>
             <w:r>
               <w:rPr>
                 <w:rFonts w:ascii="Georgia" w:hAnsi="Georgia" w:cs="Courier New"/>
+                <w:sz w:val="21"/>
+                <w:szCs w:val="21"/>
+                <w:lang w:val="bg-BG" w:eastAsia="bg-BG"/>
+              </w:rPr>
+              <w:t xml:space="preserve">продажна цена, като към датата на подписване на настоящия окончателен договор във формата на нотариален акт дължимата сума от общата продажна цена е в размер на </w:t>
+            </w:r>
+            <w:r>
+              <w:rPr>
+                <w:rFonts w:ascii="Georgia" w:hAnsi="Georgia" w:cs="Courier New"/>
+                <w:b/>
+                <w:sz w:val="21"/>
+                <w:szCs w:val="21"/>
+                <w:lang w:val="bg-BG" w:eastAsia="bg-BG"/>
+              </w:rPr>
+              <w:t xml:space="preserve">324 000 евро (триста двадесет и </w:t>
+            </w:r>
+            <w:r>
+              <w:rPr>
+                <w:rFonts w:ascii="Georgia" w:hAnsi="Georgia" w:cs="Courier New"/>
                 <w:b/>
                 <w:sz w:val="21"/>
                 <w:szCs w:val="21"/>
                 <w:lang w:val="bg-BG" w:eastAsia="bg-BG"/>
               </w:rPr>
               <w:lastRenderedPageBreak/>
-              <w:t>(тридесет и шест хиляди евро)</w:t>
-            </w:r>
-            <w:r>
-              <w:rPr>
-                <w:rFonts w:ascii="Georgia" w:hAnsi="Georgia" w:cs="Courier New"/>
-                <w:sz w:val="21"/>
-                <w:szCs w:val="21"/>
-                <w:lang w:val="bg-BG" w:eastAsia="bg-BG"/>
-              </w:rPr>
-              <w:t xml:space="preserve">, представляваща капаро от 10 % (десет процента) от договорената </w:t>
-            </w:r>
-            <w:r>
-              <w:rPr>
-                <w:rFonts w:ascii="Georgia" w:hAnsi="Georgia" w:cs="Courier New"/>
-                <w:sz w:val="21"/>
-                <w:szCs w:val="21"/>
-                <w:lang w:val="bg-BG" w:eastAsia="bg-BG"/>
-              </w:rPr>
-              <w:t xml:space="preserve">обща </w:t>
-            </w:r>
-            <w:r>
-              <w:rPr>
-                <w:rFonts w:ascii="Georgia" w:hAnsi="Georgia" w:cs="Courier New"/>
-                <w:sz w:val="21"/>
-                <w:szCs w:val="21"/>
-                <w:lang w:val="bg-BG" w:eastAsia="bg-BG"/>
-              </w:rPr>
-              <w:t xml:space="preserve">продажна цена, като към датата на подписване на настоящия окончателен договор във формата на нотариален акт дължимата сума от общата продажна цена е в размер на </w:t>
-            </w:r>
-            <w:r>
-              <w:rPr>
-                <w:rFonts w:ascii="Georgia" w:hAnsi="Georgia" w:cs="Courier New"/>
-                <w:b/>
-                <w:sz w:val="21"/>
-                <w:szCs w:val="21"/>
-                <w:lang w:val="bg-BG" w:eastAsia="bg-BG"/>
-              </w:rPr>
-              <w:t>324 000 евро (триста двадесет и четири хиляди евро)</w:t>
+              <w:t>четири хиляди евро)</w:t>
             </w:r>
             <w:r>
               <w:rPr>
@@ -2528,7 +2436,7 @@
                 <w:szCs w:val="21"/>
                 <w:lang w:val="bg-BG" w:eastAsia="bg-BG"/>
               </w:rPr>
-              <w:t>КАМЕЛИЯ АНГЕЛОВА АНГЕЛОВА – ТОДОРОВА</w:t>
+              <w:t>{{buyerName}}</w:t>
             </w:r>
             <w:r>
               <w:rPr>
@@ -2559,7 +2467,7 @@
                 <w:szCs w:val="21"/>
                 <w:lang w:val="bg-BG" w:eastAsia="bg-BG"/>
               </w:rPr>
-              <w:t>ЕМИЛИЯ ИВАНОВА ГОРАНОВА - ВЕСТНЕР</w:t>
+              <w:t>{{sellerName}}</w:t>
             </w:r>
             <w:r>
               <w:rPr>
@@ -3317,7 +3225,7 @@
                 <w:szCs w:val="21"/>
                 <w:lang w:val="bg-BG" w:eastAsia="bg-BG"/>
               </w:rPr>
-              <w:t>ЕМИЛИЯ ИВАНОВА ГОРАНОВА - ВЕСТНЕР</w:t>
+              <w:t>{{sellerName}}</w:t>
             </w:r>
             <w:r>
               <w:rPr>
@@ -3753,7 +3661,7 @@
                 <w:szCs w:val="21"/>
                 <w:lang w:val="bg-BG" w:eastAsia="bg-BG"/>
               </w:rPr>
-              <w:t>КАМЕЛИЯ АНГЕЛОВА АНГЕЛОВА – ТОДОРОВА</w:t>
+              <w:t>{{buyerName}}</w:t>
             </w:r>
             <w:r>
               <w:rPr>
@@ -3781,7 +3689,7 @@
                 <w:szCs w:val="21"/>
                 <w:lang w:val="bg-BG" w:eastAsia="bg-BG"/>
               </w:rPr>
-              <w:t>ЕМИЛИЯ ИВАНОВА ГОРАНОВА - ВЕСТНЕР</w:t>
+              <w:t>{{sellerName}}</w:t>
             </w:r>
             <w:r>
               <w:rPr>
@@ -4736,7 +4644,7 @@
                 <w:szCs w:val="21"/>
                 <w:lang w:val="bg-BG" w:eastAsia="bg-BG"/>
               </w:rPr>
-              <w:t>КАМЕЛИЯ АНГЕЛОВА АНГЕЛОВА – ТОДОРОВА</w:t>
+              <w:t>{{buyerName}}</w:t>
             </w:r>
             <w:r>
               <w:rPr>
@@ -5009,17 +4917,7 @@
                 <w:szCs w:val="21"/>
                 <w:lang w:val="bg-BG" w:eastAsia="bg-BG"/>
               </w:rPr>
-              <w:t xml:space="preserve">Преди извършването и подписването на нотариалния акт, в изпълнение на задълженията </w:t>
-            </w:r>
-            <w:r>
-              <w:rPr>
-                <w:rFonts w:ascii="Georgia" w:hAnsi="Georgia"/>
-                <w:sz w:val="21"/>
-                <w:szCs w:val="21"/>
-                <w:lang w:val="bg-BG" w:eastAsia="bg-BG"/>
-              </w:rPr>
-              <w:lastRenderedPageBreak/>
-              <w:t xml:space="preserve">си по </w:t>
+              <w:t xml:space="preserve">Преди извършването и подписването на нотариалния акт, в изпълнение на задълженията си по </w:t>
             </w:r>
             <w:r>
               <w:rPr>
@@ -5068,6 +4966,7 @@
                 <w:szCs w:val="21"/>
                 <w:lang w:val="bg-BG" w:eastAsia="bg-BG"/>
               </w:rPr>
+              <w:lastRenderedPageBreak/>
               <w:t xml:space="preserve">           </w:t>
             </w:r>
             <w:r>
@@ -7107,6 +7006,7 @@
   <w:style w:type="character" w:default="1" w:styleId="DefaultParagraphFont">
     <w:name w:val="Default Paragraph Font"/>
     <w:uiPriority w:val="1"/>
+    <w:semiHidden/>
     <w:unhideWhenUsed/>
   </w:style>
   <w:style w:type="table" w:default="1" w:styleId="TableNormal">

</xml_diff>

<commit_message>
Add formatted money placeholders to DOCX template
</commit_message>
<xml_diff>
--- a/backend/templates/notarial-act-template.docx
+++ b/backend/templates/notarial-act-template.docx
@@ -1091,9 +1091,9 @@
                 <w:rFonts w:ascii="Georgia" w:hAnsi="Georgia" w:cs="Georgia"/>
                 <w:sz w:val="21"/>
                 <w:szCs w:val="21"/>
-                <w:lang w:val="en-US" w:eastAsia="bg-BG"/>
-              </w:rPr>
-              <w:t>02</w:t>
+                <w:lang w:eastAsia="bg-BG"/>
+              </w:rPr>
+              <w:t>{{contractDate}}</w:t>
             </w:r>
             <w:r>
               <w:rPr>
@@ -1102,7 +1102,7 @@
                 <w:szCs w:val="21"/>
                 <w:lang w:val="bg-BG" w:eastAsia="bg-BG"/>
               </w:rPr>
-              <w:t>.0</w:t>
+              <w:t xml:space="preserve"> (</w:t>
             </w:r>
             <w:r>
               <w:rPr>
@@ -1111,7 +1111,7 @@
                 <w:szCs w:val="21"/>
                 <w:lang w:val="bg-BG" w:eastAsia="bg-BG"/>
               </w:rPr>
-              <w:t>4</w:t>
+              <w:t>втори април</w:t>
             </w:r>
             <w:r>
               <w:rPr>
@@ -1120,36 +1120,18 @@
                 <w:szCs w:val="21"/>
                 <w:lang w:val="bg-BG" w:eastAsia="bg-BG"/>
               </w:rPr>
-              <w:t>.2026 г. (</w:t>
+              <w:t xml:space="preserve"> две хиляди двадесет и шеста година), пред мен </w:t>
             </w:r>
             <w:r>
               <w:rPr>
                 <w:rFonts w:ascii="Georgia" w:hAnsi="Georgia" w:cs="Georgia"/>
-                <w:sz w:val="21"/>
-                <w:szCs w:val="21"/>
-                <w:lang w:val="bg-BG" w:eastAsia="bg-BG"/>
-              </w:rPr>
-              <w:t>втори април</w:t>
-            </w:r>
-            <w:r>
-              <w:rPr>
-                <w:rFonts w:ascii="Georgia" w:hAnsi="Georgia" w:cs="Georgia"/>
-                <w:sz w:val="21"/>
-                <w:szCs w:val="21"/>
-                <w:lang w:val="bg-BG" w:eastAsia="bg-BG"/>
-              </w:rPr>
-              <w:t xml:space="preserve"> две хиляди двадесет и шеста година), пред мен </w:t>
-            </w:r>
-            <w:r>
-              <w:rPr>
-                <w:rFonts w:ascii="Georgia" w:hAnsi="Georgia" w:cs="Georgia"/>
                 <w:b/>
                 <w:bCs/>
                 <w:sz w:val="21"/>
                 <w:szCs w:val="21"/>
                 <w:lang w:val="bg-BG" w:eastAsia="bg-BG"/>
               </w:rPr>
-              <w:t>ВАЛЕНТИНА ГЕОРГИЕВА</w:t>
+              <w:t>{{notaryName}}</w:t>
             </w:r>
             <w:r>
               <w:rPr>
@@ -2058,7 +2040,7 @@
                 <w:szCs w:val="21"/>
                 <w:lang w:val="bg-BG" w:eastAsia="bg-BG"/>
               </w:rPr>
-              <w:t>{{salePrice}}</w:t>
+              <w:t>{{salePriceFormatted}}</w:t>
             </w:r>
             <w:r>
               <w:rPr>
@@ -2194,43 +2176,25 @@
                 <w:szCs w:val="21"/>
                 <w:lang w:val="bg-BG" w:eastAsia="bg-BG"/>
               </w:rPr>
-              <w:t>Предварителен договор от 24</w:t>
-            </w:r>
-            <w:r>
-              <w:rPr>
-                <w:rFonts w:ascii="Georgia" w:hAnsi="Georgia"/>
-                <w:sz w:val="21"/>
-                <w:szCs w:val="21"/>
-                <w:lang w:val="en-US" w:eastAsia="bg-BG"/>
-              </w:rPr>
-              <w:t>.</w:t>
-            </w:r>
-            <w:r>
-              <w:rPr>
-                <w:rFonts w:ascii="Georgia" w:hAnsi="Georgia"/>
-                <w:sz w:val="21"/>
-                <w:szCs w:val="21"/>
-                <w:lang w:val="bg-BG" w:eastAsia="bg-BG"/>
-              </w:rPr>
-              <w:t>02</w:t>
-            </w:r>
-            <w:r>
-              <w:rPr>
-                <w:rFonts w:ascii="Georgia" w:hAnsi="Georgia"/>
-                <w:sz w:val="21"/>
-                <w:szCs w:val="21"/>
-                <w:lang w:val="en-US" w:eastAsia="bg-BG"/>
-              </w:rPr>
-              <w:t xml:space="preserve">.2026 </w:t>
-            </w:r>
-            <w:r>
-              <w:rPr>
-                <w:rFonts w:ascii="Georgia" w:hAnsi="Georgia"/>
-                <w:sz w:val="21"/>
-                <w:szCs w:val="21"/>
-                <w:lang w:val="bg-BG" w:eastAsia="bg-BG"/>
-              </w:rPr>
-              <w:t xml:space="preserve">година, по силата на който </w:t>
+              <w:t xml:space="preserve">Предварителен договор от </w:t>
+            </w:r>
+            <w:r>
+              <w:rPr>
+                <w:rFonts w:ascii="Georgia" w:hAnsi="Georgia"/>
+                <w:sz w:val="21"/>
+                <w:szCs w:val="21"/>
+                <w:lang w:eastAsia="bg-BG"/>
+              </w:rPr>
+              <w:t>{{preliminaryContractDate}}</w:t>
+            </w:r>
+            <w:r>
+              <w:rPr>
+                <w:rFonts w:ascii="Georgia" w:hAnsi="Georgia"/>
+                <w:sz w:val="21"/>
+                <w:szCs w:val="21"/>
+                <w:lang w:val="bg-BG" w:eastAsia="bg-BG"/>
+              </w:rPr>
+              <w:t xml:space="preserve">, по силата на който </w:t>
             </w:r>
             <w:r>
               <w:rPr>
@@ -2291,7 +2255,7 @@
                 <w:szCs w:val="21"/>
                 <w:lang w:val="bg-BG" w:eastAsia="bg-BG"/>
               </w:rPr>
-              <w:t>36 000 евро (тридесет и шест хиляди евро)</w:t>
+              <w:t>{{depositAmountFormatted}}</w:t>
             </w:r>
             <w:r>
               <w:rPr>
@@ -2328,85 +2292,84 @@
                 <w:szCs w:val="21"/>
                 <w:lang w:val="bg-BG" w:eastAsia="bg-BG"/>
               </w:rPr>
-              <w:t xml:space="preserve">324 000 евро (триста двадесет и </w:t>
+              <w:t>{{remainingAmountFormatted}}</w:t>
             </w:r>
             <w:r>
               <w:rPr>
                 <w:rFonts w:ascii="Georgia" w:hAnsi="Georgia" w:cs="Courier New"/>
-                <w:b/>
+                <w:sz w:val="21"/>
+                <w:szCs w:val="21"/>
+                <w:lang w:val="bg-BG" w:eastAsia="bg-BG"/>
+              </w:rPr>
+              <w:t>.--------------------------------------</w:t>
+            </w:r>
+            <w:r>
+              <w:rPr>
+                <w:rFonts w:ascii="Georgia" w:hAnsi="Georgia" w:cs="Courier New"/>
                 <w:sz w:val="21"/>
                 <w:szCs w:val="21"/>
                 <w:lang w:val="bg-BG" w:eastAsia="bg-BG"/>
               </w:rPr>
               <w:lastRenderedPageBreak/>
-              <w:t>четири хиляди евро)</w:t>
+              <w:t>------</w:t>
+            </w:r>
+          </w:p>
+          <w:p>
+            <w:pPr>
+              <w:jc w:val="both"/>
+              <w:rPr>
+                <w:rFonts w:ascii="Georgia" w:hAnsi="Georgia"/>
+                <w:sz w:val="21"/>
+                <w:szCs w:val="21"/>
+                <w:lang w:val="bg-BG" w:eastAsia="bg-BG"/>
+              </w:rPr>
+            </w:pPr>
+            <w:r>
+              <w:rPr>
+                <w:rFonts w:ascii="Georgia" w:hAnsi="Georgia" w:cs="Georgia"/>
+                <w:sz w:val="21"/>
+                <w:szCs w:val="21"/>
+                <w:lang w:val="bg-BG" w:eastAsia="bg-BG"/>
+              </w:rPr>
+              <w:t xml:space="preserve">           </w:t>
+            </w:r>
+            <w:r>
+              <w:rPr>
+                <w:rFonts w:ascii="Georgia" w:hAnsi="Georgia" w:cs="Georgia"/>
+                <w:b/>
+                <w:sz w:val="21"/>
+                <w:szCs w:val="21"/>
+                <w:lang w:val="bg-BG" w:eastAsia="bg-BG"/>
+              </w:rPr>
+              <w:t>3.</w:t>
+            </w:r>
+            <w:r>
+              <w:rPr>
+                <w:rFonts w:ascii="Georgia" w:hAnsi="Georgia" w:cs="Georgia"/>
+                <w:sz w:val="21"/>
+                <w:szCs w:val="21"/>
+                <w:lang w:val="bg-BG" w:eastAsia="bg-BG"/>
+              </w:rPr>
+              <w:t xml:space="preserve"> Остатъкът от дължимата обща п</w:t>
+            </w:r>
+            <w:r>
+              <w:rPr>
+                <w:rFonts w:ascii="Georgia" w:hAnsi="Georgia" w:cs="Georgia"/>
+                <w:sz w:val="21"/>
+                <w:szCs w:val="21"/>
+                <w:lang w:val="bg-BG" w:eastAsia="bg-BG"/>
+              </w:rPr>
+              <w:t xml:space="preserve">родажна цена за подробно описания в цялата предходна точка първа от нотариалния акт недвижим имот, в размер на </w:t>
             </w:r>
             <w:r>
               <w:rPr>
                 <w:rFonts w:ascii="Georgia" w:hAnsi="Georgia" w:cs="Courier New"/>
-                <w:sz w:val="21"/>
-                <w:szCs w:val="21"/>
-                <w:lang w:val="bg-BG" w:eastAsia="bg-BG"/>
-              </w:rPr>
-              <w:t>.--------------------------------------------</w:t>
-            </w:r>
-          </w:p>
-          <w:p>
-            <w:pPr>
-              <w:jc w:val="both"/>
-              <w:rPr>
-                <w:rFonts w:ascii="Georgia" w:hAnsi="Georgia"/>
-                <w:sz w:val="21"/>
-                <w:szCs w:val="21"/>
-                <w:lang w:val="bg-BG" w:eastAsia="bg-BG"/>
-              </w:rPr>
-            </w:pPr>
-            <w:r>
-              <w:rPr>
-                <w:rFonts w:ascii="Georgia" w:hAnsi="Georgia" w:cs="Georgia"/>
-                <w:sz w:val="21"/>
-                <w:szCs w:val="21"/>
-                <w:lang w:val="bg-BG" w:eastAsia="bg-BG"/>
-              </w:rPr>
-              <w:t xml:space="preserve">           </w:t>
-            </w:r>
-            <w:r>
-              <w:rPr>
-                <w:rFonts w:ascii="Georgia" w:hAnsi="Georgia" w:cs="Georgia"/>
-                <w:b/>
-                <w:sz w:val="21"/>
-                <w:szCs w:val="21"/>
-                <w:lang w:val="bg-BG" w:eastAsia="bg-BG"/>
-              </w:rPr>
-              <w:t>3.</w:t>
-            </w:r>
-            <w:r>
-              <w:rPr>
-                <w:rFonts w:ascii="Georgia" w:hAnsi="Georgia" w:cs="Georgia"/>
-                <w:sz w:val="21"/>
-                <w:szCs w:val="21"/>
-                <w:lang w:val="bg-BG" w:eastAsia="bg-BG"/>
-              </w:rPr>
-              <w:t xml:space="preserve"> Остатъкът от дължимата обща п</w:t>
-            </w:r>
-            <w:r>
-              <w:rPr>
-                <w:rFonts w:ascii="Georgia" w:hAnsi="Georgia" w:cs="Georgia"/>
-                <w:sz w:val="21"/>
-                <w:szCs w:val="21"/>
-                <w:lang w:val="bg-BG" w:eastAsia="bg-BG"/>
-              </w:rPr>
-              <w:t xml:space="preserve">родажна цена за подробно описания в цялата предходна точка първа от нотариалния акт недвижим имот, в размер на </w:t>
-            </w:r>
-            <w:r>
-              <w:rPr>
-                <w:rFonts w:ascii="Georgia" w:hAnsi="Georgia" w:cs="Courier New"/>
-                <w:b/>
-                <w:sz w:val="21"/>
-                <w:szCs w:val="21"/>
-                <w:lang w:val="bg-BG" w:eastAsia="bg-BG"/>
-              </w:rPr>
-              <w:t>324 000 евро (триста двадесет и четири хиляди евро)</w:t>
+                <w:b/>
+                <w:sz w:val="21"/>
+                <w:szCs w:val="21"/>
+                <w:lang w:val="bg-BG" w:eastAsia="bg-BG"/>
+              </w:rPr>
+              <w:t>{{remainingAmountFormatted}}</w:t>
             </w:r>
             <w:r>
               <w:rPr>
@@ -2577,9 +2540,9 @@
                 <w:spacing w:val="3"/>
                 <w:sz w:val="21"/>
                 <w:szCs w:val="21"/>
-                <w:lang w:val="en-US" w:eastAsia="bg-BG"/>
-              </w:rPr>
-              <w:t>UNCRBGSF</w:t>
+                <w:lang w:eastAsia="bg-BG"/>
+              </w:rPr>
+              <w:t>{{bankBic}}</w:t>
             </w:r>
             <w:r>
               <w:rPr>
@@ -2611,153 +2574,9 @@
                 <w:spacing w:val="3"/>
                 <w:sz w:val="21"/>
                 <w:szCs w:val="21"/>
-                <w:lang w:val="en-US" w:eastAsia="bg-BG"/>
-              </w:rPr>
-              <w:t>BG</w:t>
-            </w:r>
-            <w:r>
-              <w:rPr>
-                <w:rFonts w:ascii="Georgia" w:hAnsi="Georgia"/>
-                <w:b/>
-                <w:color w:val="000000"/>
-                <w:spacing w:val="3"/>
-                <w:sz w:val="21"/>
-                <w:szCs w:val="21"/>
-                <w:lang w:val="bg-BG" w:eastAsia="bg-BG"/>
-              </w:rPr>
-              <w:t xml:space="preserve"> </w:t>
-            </w:r>
-            <w:r>
-              <w:rPr>
-                <w:rFonts w:ascii="Georgia" w:hAnsi="Georgia"/>
-                <w:b/>
-                <w:color w:val="000000"/>
-                <w:spacing w:val="3"/>
-                <w:sz w:val="21"/>
-                <w:szCs w:val="21"/>
-                <w:lang w:val="en-US" w:eastAsia="bg-BG"/>
-              </w:rPr>
-              <w:t>67</w:t>
-            </w:r>
-            <w:r>
-              <w:rPr>
-                <w:rFonts w:ascii="Georgia" w:hAnsi="Georgia"/>
-                <w:b/>
-                <w:color w:val="000000"/>
-                <w:spacing w:val="3"/>
-                <w:sz w:val="21"/>
-                <w:szCs w:val="21"/>
-                <w:lang w:val="bg-BG" w:eastAsia="bg-BG"/>
-              </w:rPr>
-              <w:t xml:space="preserve"> </w:t>
-            </w:r>
-            <w:r>
-              <w:rPr>
-                <w:rFonts w:ascii="Georgia" w:hAnsi="Georgia"/>
-                <w:b/>
-                <w:color w:val="000000"/>
-                <w:spacing w:val="3"/>
-                <w:sz w:val="21"/>
-                <w:szCs w:val="21"/>
-                <w:lang w:val="en-US" w:eastAsia="bg-BG"/>
-              </w:rPr>
-              <w:t>UNCR</w:t>
-            </w:r>
-            <w:r>
-              <w:rPr>
-                <w:rFonts w:ascii="Georgia" w:hAnsi="Georgia"/>
-                <w:b/>
-                <w:color w:val="000000"/>
-                <w:spacing w:val="3"/>
-                <w:sz w:val="21"/>
-                <w:szCs w:val="21"/>
-                <w:lang w:val="bg-BG" w:eastAsia="bg-BG"/>
-              </w:rPr>
-              <w:t xml:space="preserve"> </w:t>
-            </w:r>
-            <w:r>
-              <w:rPr>
-                <w:rFonts w:ascii="Georgia" w:hAnsi="Georgia"/>
-                <w:b/>
-                <w:color w:val="000000"/>
-                <w:spacing w:val="3"/>
-                <w:sz w:val="21"/>
-                <w:szCs w:val="21"/>
-                <w:lang w:val="en-US" w:eastAsia="bg-BG"/>
-              </w:rPr>
-              <w:t>7000</w:t>
-            </w:r>
-            <w:r>
-              <w:rPr>
-                <w:rFonts w:ascii="Georgia" w:hAnsi="Georgia"/>
-                <w:b/>
-                <w:color w:val="000000"/>
-                <w:spacing w:val="3"/>
-                <w:sz w:val="21"/>
-                <w:szCs w:val="21"/>
-                <w:lang w:val="bg-BG" w:eastAsia="bg-BG"/>
-              </w:rPr>
-              <w:t xml:space="preserve"> </w:t>
-            </w:r>
-            <w:r>
-              <w:rPr>
-                <w:rFonts w:ascii="Georgia" w:hAnsi="Georgia"/>
-                <w:b/>
-                <w:color w:val="000000"/>
-                <w:spacing w:val="3"/>
-                <w:sz w:val="21"/>
-                <w:szCs w:val="21"/>
-                <w:lang w:val="en-US" w:eastAsia="bg-BG"/>
-              </w:rPr>
-              <w:t>4522</w:t>
-            </w:r>
-            <w:r>
-              <w:rPr>
-                <w:rFonts w:ascii="Georgia" w:hAnsi="Georgia"/>
-                <w:b/>
-                <w:color w:val="000000"/>
-                <w:spacing w:val="3"/>
-                <w:sz w:val="21"/>
-                <w:szCs w:val="21"/>
-                <w:lang w:val="bg-BG" w:eastAsia="bg-BG"/>
-              </w:rPr>
-              <w:t xml:space="preserve"> </w:t>
-            </w:r>
-            <w:r>
-              <w:rPr>
-                <w:rFonts w:ascii="Georgia" w:hAnsi="Georgia"/>
-                <w:b/>
-                <w:color w:val="000000"/>
-                <w:spacing w:val="3"/>
-                <w:sz w:val="21"/>
-                <w:szCs w:val="21"/>
-                <w:lang w:val="en-US" w:eastAsia="bg-BG"/>
-              </w:rPr>
-              <w:t>6900</w:t>
-            </w:r>
-            <w:r>
-              <w:rPr>
-                <w:rFonts w:ascii="Georgia" w:hAnsi="Georgia"/>
-                <w:b/>
-                <w:color w:val="000000"/>
-                <w:spacing w:val="3"/>
-                <w:sz w:val="21"/>
-                <w:szCs w:val="21"/>
-                <w:lang w:val="bg-BG" w:eastAsia="bg-BG"/>
-              </w:rPr>
-              <w:t xml:space="preserve"> </w:t>
-            </w:r>
-            <w:r>
-              <w:rPr>
-                <w:rFonts w:ascii="Georgia" w:hAnsi="Georgia"/>
-                <w:b/>
-                <w:color w:val="000000"/>
-                <w:spacing w:val="3"/>
-                <w:sz w:val="21"/>
-                <w:szCs w:val="21"/>
-                <w:lang w:val="en-US" w:eastAsia="bg-BG"/>
-              </w:rPr>
-              <w:t>18</w:t>
+                <w:lang w:eastAsia="bg-BG"/>
+              </w:rPr>
+              <w:t>{{bankIban}}</w:t>
             </w:r>
             <w:r>
               <w:rPr>
@@ -2941,96 +2760,25 @@
                 <w:szCs w:val="21"/>
                 <w:lang w:val="en-US" w:eastAsia="bg-BG"/>
               </w:rPr>
-              <w:t>48 492</w:t>
-            </w:r>
-            <w:r>
-              <w:rPr>
-                <w:rFonts w:ascii="Georgia" w:hAnsi="Georgia"/>
-                <w:b/>
-                <w:bCs/>
-                <w:sz w:val="21"/>
-                <w:szCs w:val="21"/>
-                <w:lang w:val="bg-BG" w:eastAsia="bg-BG"/>
-              </w:rPr>
-              <w:t>, 90</w:t>
-            </w:r>
-            <w:r>
-              <w:rPr>
-                <w:rFonts w:ascii="Georgia" w:hAnsi="Georgia"/>
-                <w:b/>
-                <w:bCs/>
-                <w:sz w:val="21"/>
-                <w:szCs w:val="21"/>
-                <w:lang w:val="bg-BG" w:eastAsia="bg-BG"/>
-              </w:rPr>
-              <w:t xml:space="preserve"> </w:t>
-            </w:r>
-            <w:r>
-              <w:rPr>
-                <w:rFonts w:ascii="Georgia" w:hAnsi="Georgia"/>
-                <w:b/>
-                <w:bCs/>
-                <w:sz w:val="21"/>
-                <w:szCs w:val="21"/>
-                <w:lang w:val="bg-BG" w:eastAsia="bg-BG"/>
-              </w:rPr>
-              <w:t>евро</w:t>
-            </w:r>
-            <w:r>
-              <w:rPr>
-                <w:rFonts w:ascii="Georgia" w:hAnsi="Georgia"/>
-                <w:b/>
-                <w:bCs/>
-                <w:sz w:val="21"/>
-                <w:szCs w:val="21"/>
-                <w:lang w:val="bg-BG" w:eastAsia="bg-BG"/>
-              </w:rPr>
-              <w:t xml:space="preserve"> </w:t>
-            </w:r>
-            <w:r>
-              <w:rPr>
-                <w:rFonts w:ascii="Georgia" w:hAnsi="Georgia"/>
-                <w:sz w:val="21"/>
-                <w:szCs w:val="21"/>
-                <w:lang w:val="bg-BG" w:eastAsia="bg-BG"/>
-              </w:rPr>
-              <w:t>(</w:t>
-            </w:r>
-            <w:r>
-              <w:rPr>
-                <w:rFonts w:ascii="Georgia" w:hAnsi="Georgia"/>
-                <w:sz w:val="21"/>
-                <w:szCs w:val="21"/>
-                <w:lang w:val="bg-BG" w:eastAsia="bg-BG"/>
-              </w:rPr>
-              <w:t>четиридесет и осем хиляди четиристотин деветдесет и две евро и деветдесет евроцента</w:t>
-            </w:r>
-            <w:r>
-              <w:rPr>
-                <w:rFonts w:ascii="Georgia" w:hAnsi="Georgia"/>
-                <w:sz w:val="21"/>
-                <w:szCs w:val="21"/>
-                <w:lang w:val="bg-BG" w:eastAsia="bg-BG"/>
-              </w:rPr>
-              <w:t>), съгласно Удостоверение за данъчна оценка с изх. № 7</w:t>
-            </w:r>
-            <w:r>
-              <w:rPr>
-                <w:rFonts w:ascii="Georgia" w:hAnsi="Georgia"/>
-                <w:sz w:val="21"/>
-                <w:szCs w:val="21"/>
-                <w:lang w:val="bg-BG" w:eastAsia="bg-BG"/>
-              </w:rPr>
-              <w:t>2</w:t>
-            </w:r>
-            <w:r>
-              <w:rPr>
-                <w:rFonts w:ascii="Georgia" w:hAnsi="Georgia"/>
-                <w:sz w:val="21"/>
-                <w:szCs w:val="21"/>
-                <w:lang w:val="bg-BG" w:eastAsia="bg-BG"/>
-              </w:rPr>
-              <w:t>24051164</w:t>
+              <w:t>{{taxEvaluationFormatted}}</w:t>
+            </w:r>
+            <w:r>
+              <w:rPr>
+                <w:rFonts w:ascii="Georgia" w:hAnsi="Georgia"/>
+                <w:sz w:val="21"/>
+                <w:szCs w:val="21"/>
+                <w:lang w:val="bg-BG" w:eastAsia="bg-BG"/>
+              </w:rPr>
+              <w:t xml:space="preserve">, съгласно Удостоверение за данъчна оценка с изх. № </w:t>
+            </w:r>
+            <w:r>
+              <w:rPr>
+                <w:rFonts w:ascii="Georgia" w:hAnsi="Georgia"/>
+                <w:sz w:val="21"/>
+                <w:szCs w:val="21"/>
+                <w:lang w:eastAsia="bg-BG"/>
+              </w:rPr>
+              <w:t>{{taxEvaluationNumber}}</w:t>
             </w:r>
             <w:r>
               <w:rPr>
@@ -3046,54 +2794,18 @@
                 <w:rFonts w:ascii="Georgia" w:hAnsi="Georgia"/>
                 <w:sz w:val="21"/>
                 <w:szCs w:val="21"/>
-                <w:lang w:val="bg-BG" w:eastAsia="bg-BG"/>
-              </w:rPr>
-              <w:t>25</w:t>
-            </w:r>
-            <w:r>
-              <w:rPr>
-                <w:rFonts w:ascii="Georgia" w:hAnsi="Georgia"/>
-                <w:sz w:val="21"/>
-                <w:szCs w:val="21"/>
-                <w:lang w:val="bg-BG" w:eastAsia="bg-BG"/>
-              </w:rPr>
-              <w:t>.0</w:t>
-            </w:r>
-            <w:r>
-              <w:rPr>
-                <w:rFonts w:ascii="Georgia" w:hAnsi="Georgia"/>
-                <w:sz w:val="21"/>
-                <w:szCs w:val="21"/>
-                <w:lang w:val="bg-BG" w:eastAsia="bg-BG"/>
-              </w:rPr>
-              <w:t>3</w:t>
-            </w:r>
-            <w:r>
-              <w:rPr>
-                <w:rFonts w:ascii="Georgia" w:hAnsi="Georgia"/>
-                <w:sz w:val="21"/>
-                <w:szCs w:val="21"/>
-                <w:lang w:val="bg-BG" w:eastAsia="bg-BG"/>
-              </w:rPr>
-              <w:t>.202</w:t>
-            </w:r>
-            <w:r>
-              <w:rPr>
-                <w:rFonts w:ascii="Georgia" w:hAnsi="Georgia"/>
-                <w:sz w:val="21"/>
-                <w:szCs w:val="21"/>
-                <w:lang w:val="bg-BG" w:eastAsia="bg-BG"/>
-              </w:rPr>
-              <w:t>6</w:t>
-            </w:r>
-            <w:r>
-              <w:rPr>
-                <w:rFonts w:ascii="Georgia" w:hAnsi="Georgia"/>
-                <w:sz w:val="21"/>
-                <w:szCs w:val="21"/>
-                <w:lang w:val="bg-BG" w:eastAsia="bg-BG"/>
-              </w:rPr>
-              <w:t xml:space="preserve"> г. от Столична община, Дирекция „Общински приходи“, Отдел ОП „</w:t>
+                <w:lang w:eastAsia="bg-BG"/>
+              </w:rPr>
+              <w:t>{{taxEvaluationDate}}</w:t>
+            </w:r>
+            <w:r>
+              <w:rPr>
+                <w:rFonts w:ascii="Georgia" w:hAnsi="Georgia"/>
+                <w:sz w:val="21"/>
+                <w:szCs w:val="21"/>
+                <w:lang w:val="bg-BG" w:eastAsia="bg-BG"/>
+              </w:rPr>
+              <w:t xml:space="preserve"> от Столична община, Дирекция „Общински приходи“, Отдел ОП „</w:t>
             </w:r>
             <w:r>
               <w:rPr>
@@ -7006,7 +6718,6 @@
   <w:style w:type="character" w:default="1" w:styleId="DefaultParagraphFont">
     <w:name w:val="Default Paragraph Font"/>
     <w:uiPriority w:val="1"/>
-    <w:semiHidden/>
     <w:unhideWhenUsed/>
   </w:style>
   <w:style w:type="table" w:default="1" w:styleId="TableNormal">

</xml_diff>